<commit_message>
Renomeia frequencia para regencia e atualiza nome da instituicao para Complexo Paulo Vargas
</commit_message>
<xml_diff>
--- a/RESUMO_1_PAGINA.docx
+++ b/RESUMO_1_PAGINA.docx
@@ -15,7 +15,7 @@
           <w:color w:val="6B7280"/>
           <w:sz w:val="18"/>
         </w:rPr>
-        <w:t>SENAI · SERVIÇO NACIONAL DE APRENDIZAGEM INDUSTRIAL</w:t>
+        <w:t>Complexo de Educação, Tecnologia, Inovação e Saúde Paulo Vargas</w:t>
       </w:r>
     </w:p>
     <w:p>
@@ -47,7 +47,7 @@
           <w:color w:val="0B0F14"/>
           <w:sz w:val="22"/>
         </w:rPr>
-        <w:t>Frequência dos instrutores em sala de aula · Escola SENAI Vila Canaã · Quadro 2026</w:t>
+        <w:t>Regência dos instrutores em sala de aula · Complexo de Educação, Tecnologia, Inovação e Saúde Paulo Vargas · Quadro 2026</w:t>
       </w:r>
     </w:p>
     <w:tbl>
@@ -91,7 +91,7 @@
                 <w:color w:val="6B7280"/>
                 <w:sz w:val="17"/>
               </w:rPr>
-              <w:t>FREQUÊNCIA MÉDIA</w:t>
+              <w:t>REGÊNCIA MÉDIA</w:t>
             </w:r>
           </w:p>
         </w:tc>
@@ -319,7 +319,7 @@
           <w:color w:val="0B0F14"/>
           <w:sz w:val="19"/>
         </w:rPr>
-        <w:t>12 instrutores (27%) abaixo de 50% de frequência; 2 acima de 100% (referência).</w:t>
+        <w:t>12 instrutores (27%) abaixo de 50% de regência; 2 acima de 100% (referência).</w:t>
       </w:r>
     </w:p>
     <w:p>
@@ -495,7 +495,7 @@
           <w:color w:val="0B0F14"/>
           <w:sz w:val="19"/>
         </w:rPr>
-        <w:t>validar casos de baixa frequência (por que, o que fazer) — prioridade Manutenção automotiva.</w:t>
+        <w:t>validar casos de baixa regência (por que, o que fazer) — prioridade Manutenção automotiva.</w:t>
       </w:r>
     </w:p>
     <w:p>
@@ -559,7 +559,7 @@
           <w:color w:val="0B0F14"/>
           <w:sz w:val="19"/>
         </w:rPr>
-        <w:t>definir metas de frequência por período, respeitando férias e sazonalidade.</w:t>
+        <w:t>definir metas de regência por período, respeitando férias e sazonalidade.</w:t>
       </w:r>
     </w:p>
     <w:p>
@@ -622,7 +622,7 @@
           <w:color w:val="6B7280"/>
           <w:sz w:val="17"/>
         </w:rPr>
-        <w:t>Fonte: planilha REGÊNCIA - INSTRUTORES DO QUADRO 2026.xlsx (aba CONSOLIDADO) processada pelo BI de Regência. Gerado em 18/08/2026 — os números podem ser atualizados pela coordenação na planilha-fonte.</w:t>
+        <w:t>Fonte: planilha REGÊNCIA - INSTRUTORES DO QUADRO 2026.xlsx (aba CONSOLIDADO) processada pelo BI de Regência. Gerado em 20/08/2026 — os números podem ser atualizados pela coordenação na planilha-fonte.</w:t>
       </w:r>
     </w:p>
     <w:sectPr>

</xml_diff>